<commit_message>
Preenche enquadramento da carta v5 com dados da Programação FNE apurados
São Mateus = média renda (perfil BNB/ETENE, espaço prioritário); porte
Médio (ROB > 16 <= 90 mi) com teto de 95% do investimento nas condições
vigentes das linhas FNE 2026 (páginas oficiais BNB) - sustenta o pleito
de 95/5; mantida a nota de conferência na agência (faixa Médio I,
Tabela de tetos e Anexo D/Decreto 11.962/2024)

Co-Authored-By: Claude Fable 5 <noreply@anthropic.com>
Claude-Session: https://claude.ai/code/session_01DqEaERD1LDFtugtNrL73cp
</commit_message>
<xml_diff>
--- a/Carta_Consulta_CIPREM_5_modelo_completo.docx
+++ b/Carta_Consulta_CIPREM_5_modelo_completo.docx
@@ -284,38 +284,18 @@
           <w:sz w:val="22"/>
           <w:szCs w:val="22"/>
         </w:rPr>
-        <w:t xml:space="preserve">A estrutura proposta observa os critérios da Programação FNE vigente: o município de São Mateus/ES está classificado como [</w:t>
-      </w:r>
-      <w:r>
-        <w:rPr>
-          <w:rFonts w:ascii="Trebuchet MS" w:cs="Trebuchet MS" w:eastAsia="Trebuchet MS" w:hAnsi="Trebuchet MS"/>
-          <w:b/>
-          <w:bCs/>
-          <w:color w:val="C00000"/>
-          <w:sz w:val="22"/>
-          <w:szCs w:val="22"/>
-        </w:rPr>
-        <w:t xml:space="preserve">CLASSIFICAÇÃO PNDR DE SÃO MATEUS — CONFERIR NO ANEXO DA PROGRAMAÇÃO</w:t>
-      </w:r>
-      <w:r>
-        <w:rPr>
-          <w:rFonts w:ascii="Trebuchet MS" w:cs="Trebuchet MS" w:eastAsia="Trebuchet MS" w:hAnsi="Trebuchet MS"/>
-          <w:color w:val="C00000"/>
-          <w:sz w:val="22"/>
-          <w:szCs w:val="22"/>
-        </w:rPr>
-        <w:t xml:space="preserve">] e, pela receita operacional anual estabilizada projetada de R$ 17,45 milhões, a empresa enquadra-se no porte Médio. [</w:t>
-      </w:r>
-      <w:r>
-        <w:rPr>
-          <w:rFonts w:ascii="Trebuchet MS" w:cs="Trebuchet MS" w:eastAsia="Trebuchet MS" w:hAnsi="Trebuchet MS"/>
-          <w:b/>
-          <w:bCs/>
-          <w:color w:val="C00000"/>
-          <w:sz w:val="22"/>
-          <w:szCs w:val="22"/>
-        </w:rPr>
-        <w:t xml:space="preserve">CONFERIR NA TABELA DE TETOS DA PROGRAMAÇÃO FNE 2026 O PERCENTUAL MÁXIMO FINANCIÁVEL PARA PORTE MÉDIO NESSA TIPOLOGIA DE MUNICÍPIO — SE INFERIOR A 95%, AJUSTAR A ESTRUTURA ACIMA</w:t>
+        <w:t xml:space="preserve">A estrutura proposta observa os critérios da Programação FNE vigente. O município de São Mateus/ES é classificado como município de média renda (tipologia PNDR — perfil municipal BNB/ETENE), integrando os espaços prioritários da Programação. Pela receita operacional anual estabilizada projetada de R$ 17,45 milhões, a empresa enquadra-se no porte Médio (ROB acima de R$ 16 milhões e até R$ 90 milhões), para o qual as condições vigentes das linhas FNE preveem financiamento de até 95% do investimento — percentual compatível com a estrutura acima. [</w:t>
+      </w:r>
+      <w:r>
+        <w:rPr>
+          <w:rFonts w:ascii="Trebuchet MS" w:cs="Trebuchet MS" w:eastAsia="Trebuchet MS" w:hAnsi="Trebuchet MS"/>
+          <w:b/>
+          <w:bCs/>
+          <w:color w:val="C00000"/>
+          <w:sz w:val="22"/>
+          <w:szCs w:val="22"/>
+        </w:rPr>
+        <w:t xml:space="preserve">CONFERIR NA AGÊNCIA: enquadramento na faixa "Médio I" e a Tabela de tetos da Programação FNE 2026, bem como a tipologia de São Mateus no Anexo D vigente (Decreto 11.962/2024)</w:t>
       </w:r>
       <w:r>
         <w:rPr>

</xml_diff>

<commit_message>
Incorpora Estudo de Mercado (jun/2026) à carta v5 e harmoniza o pacote
- Carta §3 reescrita com o estudo anexo: demanda em camadas (sede
  220-230 mil t/ano de brita; regional 250-600 mil), ciclo de obras
  > R$ 1 bi nomeado (ES-318, Complexo de Saúde, Macrodrenagem Guriri,
  ES-010/ES-315, BR-101) com 70-100 mil t/ano extraordinárias, vantagem
  de frete quantificada (jazida ~35 km vs concorrentes 55-75 km) e
  oferta local mínima comprovada por CFEM/ANM 2025; B2G e Guriri
- Corrige inconsistências entre documentos: "suprimento de 100+ km"
  vira leitura do estudo (concorrentes 55-75 km + eixo Aracruz/Linhares
  como complemento) e per capita ANEPAC unificado em 4,1 t/hab (Sudeste,
  base 2014) na carta e no plano de produção (§ mercado)
- Capturável de 62 mil t/ano do censo mantido apenas no estudo anexo
  (contexto próprio), fora da carta

Co-Authored-By: Claude Fable 5 <noreply@anthropic.com>
Claude-Session: https://claude.ai/code/session_01DqEaERD1LDFtugtNrL73cp
</commit_message>
<xml_diff>
--- a/Carta_Consulta_CIPREM_5_modelo_completo.docx
+++ b/Carta_Consulta_CIPREM_5_modelo_completo.docx
@@ -377,7 +377,16 @@
           <w:sz w:val="22"/>
           <w:szCs w:val="22"/>
         </w:rPr>
-        <w:t xml:space="preserve">A operação enquadra-se na linha FNE Industrial (extração e britamento de pedras — CNAE 08.10-0/99).</w:t>
+        <w:t xml:space="preserve">A operação enquadra-se na linha FNE Industrial (extração e britamento de pedras — CNAE 08.10-0/99). </w:t>
+      </w:r>
+      <w:r>
+        <w:rPr>
+          <w:rFonts w:ascii="Trebuchet MS" w:cs="Trebuchet MS" w:eastAsia="Trebuchet MS" w:hAnsi="Trebuchet MS"/>
+          <w:color w:val="C00000"/>
+          <w:sz w:val="22"/>
+          <w:szCs w:val="22"/>
+        </w:rPr>
+        <w:t xml:space="preserve">A viabilidade mercadológica é objeto do Estudo de Mercado anexo (concorrência, censo de clientes, obras públicas e potencial de Guriri), resumido na seção 3.</w:t>
       </w:r>
     </w:p>
     <w:p>
@@ -408,22 +417,67 @@
           <w:sz w:val="22"/>
           <w:szCs w:val="22"/>
         </w:rPr>
-        <w:t xml:space="preserve">O município de São Mateus e a região norte do Espírito Santo apresentam uma combinação pouco comum: demanda consistente por agregados e ausência de pedreira comercial estabelecida no próprio município. O suprimento atual da região provém de pedreiras situadas a mais de 100 km (eixo Aracruz/Linhares), o que embute custo de frete relevante no preço entregue e confere vantagem logística imediata a um produtor local.</w:t>
-      </w:r>
-    </w:p>
-    <w:p>
-      <w:pPr>
-        <w:spacing w:after="160" w:line="276"/>
-        <w:jc w:val="both"/>
-      </w:pPr>
-      <w:r>
-        <w:rPr>
-          <w:rFonts w:ascii="Trebuchet MS" w:cs="Trebuchet MS" w:eastAsia="Trebuchet MS" w:hAnsi="Trebuchet MS"/>
-          <w:color w:val="C00000"/>
-          <w:sz w:val="22"/>
-          <w:szCs w:val="22"/>
-        </w:rPr>
-        <w:t xml:space="preserve">A demanda regional é ancorada por vetores concretos e verificáveis. No setor de construção, operam em São Mateus e Linhares centrais de concreto de grupos consolidados (Polimix e Pedramix), consumidoras contínuas de brita e areia industrial. Na infraestrutura, está em execução o novo ciclo de investimentos da BR-101/ES (concessão Ecovias Capixaba, contrato 2025–2048, com previsão de R$ 10,3 bilhões), incluindo a duplicação e terceiras faixas no trecho Linhares–Pedro Canário, que corta o município — obras intensivas em brita graduada e concreto asfáltico. Soma-se o consumo cativo do próprio grupo: a Concreto Britaki e a linha de artefatos e premoldados de cimento da própria CIPREM (CNAE 23.30-3/02) absorvem parte relevante das frações finas (pó de pedra e pedrisco), historicamente as de escoamento mais difícil em pedreiras entrantes.</w:t>
+        <w:t xml:space="preserve">Os fundamentos mercadológicos do empreendimento estão detalhados no Estudo de Mercado anexo (Projet Consultoria, jun/2026 — concorrência, censo de clientes, obras públicas e potencial de Guriri), cujos principais resultados são resumidos a seguir.</w:t>
+      </w:r>
+    </w:p>
+    <w:p>
+      <w:pPr>
+        <w:spacing w:after="160" w:line="276"/>
+        <w:jc w:val="both"/>
+      </w:pPr>
+      <w:r>
+        <w:rPr>
+          <w:rFonts w:ascii="Trebuchet MS" w:cs="Trebuchet MS" w:eastAsia="Trebuchet MS" w:hAnsi="Trebuchet MS"/>
+          <w:color w:val="C00000"/>
+          <w:sz w:val="22"/>
+          <w:szCs w:val="22"/>
+        </w:rPr>
+        <w:t xml:space="preserve">São Mateus é o 7º município mais populoso do Espírito Santo (134,4 mil habitantes estimados em 2025; crescimento de 13,5% na década) e polo de uma área de influência de 250 a 500 mil habitantes. A demanda corrente de brita apenas na sede é estimada em 220–230 mil t/ano (consumo per capita ANEPAC de 4,1 t/hab/ano de agregados no Sudeste, base 2014, aplicado de forma conservadora), e a demanda regional total situa-se entre 250 e 600 mil t/ano conforme o cenário.</w:t>
+      </w:r>
+    </w:p>
+    <w:p>
+      <w:pPr>
+        <w:spacing w:after="160" w:line="276"/>
+        <w:jc w:val="both"/>
+      </w:pPr>
+      <w:r>
+        <w:rPr>
+          <w:rFonts w:ascii="Trebuchet MS" w:cs="Trebuchet MS" w:eastAsia="Trebuchet MS" w:hAnsi="Trebuchet MS"/>
+          <w:color w:val="C00000"/>
+          <w:sz w:val="22"/>
+          <w:szCs w:val="22"/>
+        </w:rPr>
+        <w:t xml:space="preserve">A oferta local instalada, porém, é mínima: pela base de arrecadação da CFEM (ANM, granito/ES, 2025), o único produtor de porte da região opera a ~73 km da sede (Rio Bananal) e os concorrentes relevantes mais próximos — Nova Venécia e Pinheiros — produzem a 55–75 km, com parte do suprimento vindo de ainda mais longe (eixo Aracruz/Linhares). A jazida da CIPREM está a ~35 km da sede: em um produto cujo preço posto na obra é dominado pelo frete, é vantagem competitiva estrutural no maior polo de demanda da região — a operação substitui importação de brita de longa distância por produção local.</w:t>
+      </w:r>
+    </w:p>
+    <w:p>
+      <w:pPr>
+        <w:spacing w:after="160" w:line="276"/>
+        <w:jc w:val="both"/>
+      </w:pPr>
+      <w:r>
+        <w:rPr>
+          <w:rFonts w:ascii="Trebuchet MS" w:cs="Trebuchet MS" w:eastAsia="Trebuchet MS" w:hAnsi="Trebuchet MS"/>
+          <w:color w:val="C00000"/>
+          <w:sz w:val="22"/>
+          <w:szCs w:val="22"/>
+        </w:rPr>
+        <w:t xml:space="preserve">O município vive ainda um ciclo atípico de investimentos públicos, superior a R$ 1 bilhão em obras contratadas ou em licitação: Contorno de São Mateus/ES-318 (R$ 165 milhões, 24 km), Complexo de Saúde do Norte (R$ 370 milhões), Macrodrenagem e pavimentação de Guriri — Bacias 1 e 2 (R$ 628 milhões), pavimentação da ES-010 e duplicação da ES-315, além das terceiras faixas da BR-101 (concessão Ecovias Capixaba, 2025–2048). O estudo estima em 70–100 mil t/ano a demanda extraordinária de brita dessas frentes durante a janela de 3 a 4,5 anos de obras — adicional relevante sobre a demanda corrente — e em 75–90 mil t o potencial remanescente de pavimentação do balneário de Guriri, sem contar novos loteamentos.</w:t>
+      </w:r>
+    </w:p>
+    <w:p>
+      <w:pPr>
+        <w:spacing w:after="160" w:line="276"/>
+        <w:jc w:val="both"/>
+      </w:pPr>
+      <w:r>
+        <w:rPr>
+          <w:rFonts w:ascii="Trebuchet MS" w:cs="Trebuchet MS" w:eastAsia="Trebuchet MS" w:hAnsi="Trebuchet MS"/>
+          <w:color w:val="C00000"/>
+          <w:sz w:val="22"/>
+          <w:szCs w:val="22"/>
+        </w:rPr>
+        <w:t xml:space="preserve">No setor privado, operam na praça centrais de concreto de grupos consolidados (Polimix e Pedramix), consumidoras contínuas de brita e areia industrial, e soma-se o consumo cativo do próprio grupo: a Concreto Britaki e a linha de artefatos e premoldados de cimento da própria CIPREM (CNAE 23.30-3/02) absorvem parte relevante das frações finas (pó de pedra e pedrisco), historicamente as de escoamento mais difícil em pedreiras entrantes. A Prefeitura (receitas realizadas de R$ 696,7 milhões em 2024) é compradora direta para pavimentação em blocos, meios-fios e drenagem.</w:t>
       </w:r>
     </w:p>
     <w:p>
@@ -453,22 +507,7 @@
           <w:sz w:val="22"/>
           <w:szCs w:val="22"/>
         </w:rPr>
-        <w:t xml:space="preserve">Como régua de escala, o consumo nacional de referência do setor (ANEPAC) é da ordem de 2,5 toneladas de agregados por habitante/ano — para uma área de influência de ~400 mil habitantes, o platô de produção projetado (18 mil t/mês) representa fração pequena do mercado potencial, compatível com absorção gradual e sem pressão sobre preços.</w:t>
-      </w:r>
-    </w:p>
-    <w:p>
-      <w:pPr>
-        <w:spacing w:after="160" w:line="276"/>
-        <w:jc w:val="both"/>
-      </w:pPr>
-      <w:r>
-        <w:rPr>
-          <w:rFonts w:ascii="Trebuchet MS" w:cs="Trebuchet MS" w:eastAsia="Trebuchet MS" w:hAnsi="Trebuchet MS"/>
-          <w:color w:val="C00000"/>
-          <w:sz w:val="22"/>
-          <w:szCs w:val="22"/>
-        </w:rPr>
-        <w:t xml:space="preserve">O empreendimento situa-se na área de atuação da SUDENE, beneficiando-se dos instrumentos de fomento do FNE, e está alinhado às diretrizes da Política Nacional de Desenvolvimento Regional: substitui suprimento de longa distância por produção local, reduz custo de construção na região, gera emprego e renda no interior do Espírito Santo e fortalece a infraestrutura para os investimentos industriais e logísticos do norte capixaba.</w:t>
+        <w:t xml:space="preserve">O empreendimento situa-se na área de atuação da SUDENE, beneficiando-se dos instrumentos de fomento do FNE, e está alinhado às diretrizes da Política Nacional de Desenvolvimento Regional: substitui suprimento de longa distância por produção local, reduz custo de construção na região, gera emprego e renda no interior do Espírito Santo e fortalece a infraestrutura para os investimentos públicos e privados do norte capixaba.</w:t>
       </w:r>
     </w:p>
     <w:p>

</xml_diff>

<commit_message>
Enxuga Carta v5 ao tamanho do modelo LIV (2.254 vs 2.232 palavras)
- §1 Perfil 296→232: footprint condensado (polos/filiais detalhados na seção 5)
- §2 Proposição 479→408: enquadramento, garantia e comprometimento condensados
- §5 Grupo 247→225: capitais individuais e lista de cidades removidos (síntese cobre)
- Estrutura 1:1 com o modelo (10 seções + Considerações Finais)
- Nenhum dado de sustentação removido; trechos reescritos em vermelho

Co-Authored-By: Claude Fable 5 <noreply@anthropic.com>
Claude-Session: https://claude.ai/code/session_01DqEaERD1LDFtugtNrL73cp
</commit_message>
<xml_diff>
--- a/Carta_Consulta_CIPREM_5_modelo_completo.docx
+++ b/Carta_Consulta_CIPREM_5_modelo_completo.docx
@@ -124,31 +124,31 @@
           <w:sz w:val="22"/>
           <w:szCs w:val="22"/>
         </w:rPr>
-        <w:t xml:space="preserve">com pedreira em operação desde a década de 1970 — aberta originalmente para a construção da BR-101. Conforme registros públicos da Receita Federal (consulta em ago/2026), o grupo reúne 6 empresas ativas e cerca de 16 estabelecimentos em mais de 10 municípios da Bahia e de Minas Gerais — todos em área de atuação do FNE/SUDENE —, organizados em dois polos (Extremo Sul baiano e Recôncavo/Região Metropolitana de Salvador) e em expansão interestadual (filial de Salto da Divisa/MG aberta em 2025). A Concreto Britaki atende 7 praças de concreto usinado no litoral sul baiano, e a Via Nobre Construtora atua em obras rodoviárias — cadeia verticalizada da extração à aplicação, registrada em quadro societário. </w:t>
-      </w:r>
-      <w:r>
-        <w:rPr>
-          <w:rFonts w:ascii="Trebuchet MS" w:cs="Trebuchet MS" w:eastAsia="Trebuchet MS" w:hAnsi="Trebuchet MS"/>
-          <w:color w:val="C00000"/>
-          <w:sz w:val="22"/>
-          <w:szCs w:val="22"/>
-        </w:rPr>
-        <w:t xml:space="preserve">O grupo opera pedreira análoga em plena atividade — a Pedreira Vale Verde (Mineração São Vicente), em Porto Seguro/BA —, cujo modelo operacional e comercial servirá de referência direta à implantação da CIPREM.</w:t>
-      </w:r>
-    </w:p>
-    <w:p>
-      <w:pPr>
-        <w:spacing w:after="160" w:line="276"/>
-        <w:jc w:val="both"/>
-      </w:pPr>
-      <w:r>
-        <w:rPr>
-          <w:rFonts w:ascii="Trebuchet MS" w:cs="Trebuchet MS" w:eastAsia="Trebuchet MS" w:hAnsi="Trebuchet MS"/>
-          <w:color w:val="C00000"/>
-          <w:sz w:val="22"/>
-          <w:szCs w:val="22"/>
-        </w:rPr>
-        <w:t xml:space="preserve">As unidades de britagem do grupo operam com britadores METSO e laboratório próprio de controle tecnológico — exatamente a tecnologia especificada no projeto da CIPREM (britadores Metso C117 e HP350e). Essa experiência operacional em atividade idêntica à do projeto — extração, britagem, logística e comercialização de agregados — evidencia a capacidade técnica e gerencial do grupo e reduz substancialmente os riscos de implantação e de ramp-up do empreendimento ora apresentado.</w:t>
+        <w:t xml:space="preserve">com pedreira em operação desde a década de 1970 — aberta originalmente para a construção da BR-101. Conforme registros públicos da Receita Federal (consulta em ago/2026), o grupo reúne 6 empresas ativas e cerca de 16 estabelecimentos em mais de 10 municípios da Bahia e de Minas Gerais — todos em área de atuação do FNE/SUDENE —, em cadeia verticalizada da extração ao concreto usinado e às obras rodoviárias (detalhamento na seção 5). </w:t>
+      </w:r>
+      <w:r>
+        <w:rPr>
+          <w:rFonts w:ascii="Trebuchet MS" w:cs="Trebuchet MS" w:eastAsia="Trebuchet MS" w:hAnsi="Trebuchet MS"/>
+          <w:color w:val="C00000"/>
+          <w:sz w:val="22"/>
+          <w:szCs w:val="22"/>
+        </w:rPr>
+        <w:t xml:space="preserve">A Pedreira Vale Verde (Mineração São Vicente, Porto Seguro/BA), em plena atividade, servirá de modelo operacional e comercial direto à implantação da CIPREM.</w:t>
+      </w:r>
+    </w:p>
+    <w:p>
+      <w:pPr>
+        <w:spacing w:after="160" w:line="276"/>
+        <w:jc w:val="both"/>
+      </w:pPr>
+      <w:r>
+        <w:rPr>
+          <w:rFonts w:ascii="Trebuchet MS" w:cs="Trebuchet MS" w:eastAsia="Trebuchet MS" w:hAnsi="Trebuchet MS"/>
+          <w:color w:val="C00000"/>
+          <w:sz w:val="22"/>
+          <w:szCs w:val="22"/>
+        </w:rPr>
+        <w:t xml:space="preserve">As unidades de britagem do grupo operam com britadores METSO e laboratório próprio de controle tecnológico — exatamente a tecnologia especificada no projeto da CIPREM (britadores Metso C117 e HP350e). Essa experiência em atividade idêntica à do projeto evidencia a capacidade técnica e gerencial do grupo e reduz os riscos de implantação e de ramp-up do empreendimento.</w:t>
       </w:r>
     </w:p>
     <w:p>
@@ -187,7 +187,7 @@
           <w:sz w:val="22"/>
           <w:szCs w:val="22"/>
         </w:rPr>
-        <w:t xml:space="preserve">(brita 0, brita 1, brita 2, gravilinha, pó de pedra e BGS/solo-brita para base e sub-base de pavimentos e aterros)</w:t>
+        <w:t xml:space="preserve">(brita 0, brita 1, brita 2, gravilinha, pó de pedra e BGS/solo-brita)</w:t>
       </w:r>
       <w:r>
         <w:rPr>
@@ -293,18 +293,18 @@
           <w:sz w:val="22"/>
           <w:szCs w:val="22"/>
         </w:rPr>
-        <w:t xml:space="preserve">A estrutura proposta observa os critérios da Programação FNE vigente. O município de São Mateus/ES é classificado como município de média renda (tipologia PNDR — perfil municipal BNB/ETENE), integrando os espaços prioritários da Programação. Pela receita operacional anual estabilizada projetada de R$ 17,45 milhões, a empresa enquadra-se no porte Médio (ROB acima de R$ 16 milhões e até R$ 90 milhões), para o qual as condições vigentes das linhas FNE preveem financiamento de até 95% do investimento — percentual compatível com a estrutura acima. [</w:t>
-      </w:r>
-      <w:r>
-        <w:rPr>
-          <w:rFonts w:ascii="Trebuchet MS" w:cs="Trebuchet MS" w:eastAsia="Trebuchet MS" w:hAnsi="Trebuchet MS"/>
-          <w:b/>
-          <w:bCs/>
-          <w:color w:val="C00000"/>
-          <w:sz w:val="22"/>
-          <w:szCs w:val="22"/>
-        </w:rPr>
-        <w:t xml:space="preserve">CONFERIR NA AGÊNCIA: enquadramento na faixa "Médio I" e a Tabela de tetos da Programação FNE 2026, bem como a tipologia de São Mateus no Anexo D vigente (Decreto 11.962/2024)</w:t>
+        <w:t xml:space="preserve">A estrutura observa os critérios da Programação FNE vigente: São Mateus/ES é município de média renda (tipologia PNDR), integrante dos espaços prioritários, e, pela receita operacional anual estabilizada projetada de R$ 17,45 milhões, a empresa enquadra-se no porte Médio (ROB entre R$ 16 e R$ 90 milhões), para o qual as condições vigentes preveem financiamento de até 95% do investimento. [</w:t>
+      </w:r>
+      <w:r>
+        <w:rPr>
+          <w:rFonts w:ascii="Trebuchet MS" w:cs="Trebuchet MS" w:eastAsia="Trebuchet MS" w:hAnsi="Trebuchet MS"/>
+          <w:b/>
+          <w:bCs/>
+          <w:color w:val="C00000"/>
+          <w:sz w:val="22"/>
+          <w:szCs w:val="22"/>
+        </w:rPr>
+        <w:t xml:space="preserve">CONFERIR NA AGÊNCIA: faixa "Médio I", tetos da Programação FNE 2026 e tipologia no Anexo D (Decreto 11.962/2024)</w:t>
       </w:r>
       <w:r>
         <w:rPr>
@@ -343,7 +343,7 @@
           <w:sz w:val="22"/>
           <w:szCs w:val="22"/>
         </w:rPr>
-        <w:t xml:space="preserve">Ressalta-se que os sócios já realizaram, exclusivamente com recursos próprios, os investimentos preparatórios do empreendimento: aquisição do terreno de apoio (2019), contratação da servidão minerária da área de lavra, obtenção do Registro de Licença ANM e das licenças ambientais (LP e LI) — demonstrando comprometimento financeiro efetivo com o projeto e reduzindo os riscos da fase de implantação.</w:t>
+        <w:t xml:space="preserve">Ressalta-se que os sócios já realizaram, com recursos próprios, os investimentos preparatórios: aquisição do terreno de apoio (2019), contratação da servidão minerária da área de lavra e obtenção do Registro de Licença ANM e das licenças ambientais (LP e LI) — comprometimento financeiro efetivo que reduz os riscos da fase de implantação.</w:t>
       </w:r>
     </w:p>
     <w:p>
@@ -369,10 +369,11 @@
       <w:r>
         <w:rPr>
           <w:rFonts w:ascii="Trebuchet MS" w:cs="Trebuchet MS" w:eastAsia="Trebuchet MS" w:hAnsi="Trebuchet MS"/>
-          <w:sz w:val="22"/>
-          <w:szCs w:val="22"/>
-        </w:rPr>
-        <w:t xml:space="preserve">Como garantia principal da operação será apresentada alienação fiduciária de imóveis dos sócios e de empresas do grupo, com cobertura mínima de 110% do valor financiado, complementada por alienação fiduciária dos equipamentos financiados e aval dos sócios (detalhamento na seção 7).</w:t>
+          <w:color w:val="C00000"/>
+          <w:sz w:val="22"/>
+          <w:szCs w:val="22"/>
+        </w:rPr>
+        <w:t xml:space="preserve">Como garantia principal será apresentada alienação fiduciária de imóveis, com cobertura mínima de 110% do valor financiado, complementada por alienação fiduciária dos equipamentos financiados e aval dos sócios (seção 7).</w:t>
       </w:r>
     </w:p>
     <w:p>
@@ -395,7 +396,7 @@
           <w:sz w:val="22"/>
           <w:szCs w:val="22"/>
         </w:rPr>
-        <w:t xml:space="preserve">A viabilidade mercadológica é objeto do Estudo de Mercado anexo (concorrência, censo de clientes, obras públicas e potencial de Guriri), resumido na seção 3.</w:t>
+        <w:t xml:space="preserve">A viabilidade mercadológica é objeto do Estudo de Mercado anexo, resumido na seção 3.</w:t>
       </w:r>
     </w:p>
     <w:p>
@@ -832,27 +833,27 @@
           <w:sz w:val="22"/>
           <w:szCs w:val="22"/>
         </w:rPr>
-        <w:t xml:space="preserve">Mineração São Vicente Ltda (CNPJ 06.537.334/0001-85, 2004) — extração e britagem; matriz em Itagimirim/BA (BR-101, km 676) e 6 estabelecimentos, incluindo a Pedreira Vale Verde em Porto Seguro/BA e filial em Salto da Divisa/MG (2025); capital social R$ 1,5 milhão;</w:t>
-      </w:r>
-    </w:p>
-    <w:p>
-      <w:pPr>
-        <w:pStyle w:val="ListParagraph"/>
-        <w:numPr>
-          <w:ilvl w:val="0"/>
-          <w:numId w:val="1"/>
-        </w:numPr>
-        <w:spacing w:after="100" w:line="276"/>
-        <w:jc w:val="both"/>
-      </w:pPr>
-      <w:r>
-        <w:rPr>
-          <w:rFonts w:ascii="Trebuchet MS" w:cs="Trebuchet MS" w:eastAsia="Trebuchet MS" w:hAnsi="Trebuchet MS"/>
-          <w:color w:val="C00000"/>
-          <w:sz w:val="22"/>
-          <w:szCs w:val="22"/>
-        </w:rPr>
-        <w:t xml:space="preserve">Concreto Britaki Ltda (CNPJ 34.772.245/0001-59, 2019) — concreto usinado em 7 praças do litoral sul baiano (Eunápolis, Porto Seguro, Trancoso, Itagimirim, Itabela, Itamaraju e Prado); capital social R$ 1,44 milhão; a Mineração São Vicente é sócia pessoa jurídica;</w:t>
+        <w:t xml:space="preserve">Mineração São Vicente Ltda (CNPJ 06.537.334/0001-85, 2004) — extração e britagem; matriz em Itagimirim/BA e 6 estabelecimentos, incluindo a Pedreira Vale Verde em Porto Seguro/BA e filial em Salto da Divisa/MG (2025);</w:t>
+      </w:r>
+    </w:p>
+    <w:p>
+      <w:pPr>
+        <w:pStyle w:val="ListParagraph"/>
+        <w:numPr>
+          <w:ilvl w:val="0"/>
+          <w:numId w:val="1"/>
+        </w:numPr>
+        <w:spacing w:after="100" w:line="276"/>
+        <w:jc w:val="both"/>
+      </w:pPr>
+      <w:r>
+        <w:rPr>
+          <w:rFonts w:ascii="Trebuchet MS" w:cs="Trebuchet MS" w:eastAsia="Trebuchet MS" w:hAnsi="Trebuchet MS"/>
+          <w:color w:val="C00000"/>
+          <w:sz w:val="22"/>
+          <w:szCs w:val="22"/>
+        </w:rPr>
+        <w:t xml:space="preserve">Concreto Britaki Ltda (CNPJ 34.772.245/0001-59, 2019) — concreto usinado em 7 praças do litoral sul baiano; a Mineração São Vicente é sócia pessoa jurídica;</w:t>
       </w:r>
     </w:p>
     <w:p>

</xml_diff>